<commit_message>
Improve Medequip application signature cleanup and left-align it above the name.
Co-authored-by: Cursor <cursoragent@cursor.com>
</commit_message>
<xml_diff>
--- a/wilson/medequip-rwanda/Wasswa_Wilson_CV_Medequip_Biomedical_Engineer.docx
+++ b/wilson/medequip-rwanda/Wasswa_Wilson_CV_Medequip_Biomedical_Engineer.docx
@@ -1065,12 +1065,14 @@
     </w:p>
     <w:p>
       <w:pPr>
-        <w:spacing w:before="40" w:after="40"/>
+        <w:spacing w:before="20" w:after="0"/>
+        <w:ind w:left="0" w:firstLine="0"/>
+        <w:jc w:val="left"/>
       </w:pPr>
       <w:r>
         <w:drawing>
           <wp:inline xmlns:a="http://schemas.openxmlformats.org/drawingml/2006/main" xmlns:pic="http://schemas.openxmlformats.org/drawingml/2006/picture">
-            <wp:extent cx="1554480" cy="628137"/>
+            <wp:extent cx="1417320" cy="486184"/>
             <wp:docPr id="1" name="Picture 1"/>
             <wp:cNvGraphicFramePr>
               <a:graphicFrameLocks noChangeAspect="1"/>
@@ -1091,7 +1093,7 @@
                   <pic:spPr>
                     <a:xfrm>
                       <a:off x="0" y="0"/>
-                      <a:ext cx="1554480" cy="628137"/>
+                      <a:ext cx="1417320" cy="486184"/>
                     </a:xfrm>
                     <a:prstGeom prst="rect"/>
                   </pic:spPr>
@@ -1104,12 +1106,13 @@
     </w:p>
     <w:p>
       <w:pPr>
-        <w:spacing w:after="20" w:before="0" w:line="276" w:lineRule="auto"/>
+        <w:spacing w:before="40" w:after="20"/>
+        <w:jc w:val="left"/>
       </w:pPr>
       <w:r>
         <w:rPr>
           <w:rFonts w:ascii="Calibri" w:hAnsi="Calibri"/>
-          <w:color w:val="2F2F2F"/>
+          <w:b/>
           <w:sz w:val="21"/>
         </w:rPr>
         <w:t>Wasswa Wilson</w:t>
@@ -1117,13 +1120,13 @@
     </w:p>
     <w:p>
       <w:pPr>
-        <w:spacing w:after="0" w:before="0" w:line="276" w:lineRule="auto"/>
+        <w:spacing w:before="0" w:after="0"/>
+        <w:jc w:val="left"/>
       </w:pPr>
       <w:r>
         <w:rPr>
-          <w:rFonts w:ascii="Calibri" w:hAnsi="Calibri"/>
-          <w:color w:val="2F2F2F"/>
-          <w:sz w:val="21"/>
+          <w:color w:val="444444"/>
+          <w:sz w:val="20"/>
         </w:rPr>
         <w:t>Biomedical Engineer</w:t>
       </w:r>

</xml_diff>

<commit_message>
Expand Medequip CV and letter with full academic history from supporting documents.
Co-authored-by: Cursor <cursoragent@cursor.com>
</commit_message>
<xml_diff>
--- a/wilson/medequip-rwanda/Wasswa_Wilson_CV_Medequip_Biomedical_Engineer.docx
+++ b/wilson/medequip-rwanda/Wasswa_Wilson_CV_Medequip_Biomedical_Engineer.docx
@@ -894,7 +894,7 @@
           <w:b/>
           <w:sz w:val="21"/>
         </w:rPr>
-        <w:t>Makerere University</w:t>
+        <w:t>Makerere University - Faculty of Medicine</w:t>
       </w:r>
     </w:p>
     <w:p>
@@ -907,7 +907,7 @@
           <w:color w:val="2F2F2F"/>
           <w:sz w:val="21"/>
         </w:rPr>
-        <w:t>BSc Biomedical Engineering, Second Upper Honours (Class II Division I), 2012-2017</w:t>
+        <w:t>BSc Biomedical Engineering (BBIO). Second Class Honours - Upper Division. CGPA 3.69 / 5.0. 173 credit units. Studied 2012-2016 (completed May/June 2016). Reg. No. 12/U/15375/PS.</w:t>
       </w:r>
     </w:p>
     <w:p>
@@ -921,7 +921,104 @@
           <w:color w:val="1A6B5C"/>
           <w:sz w:val="20"/>
         </w:rPr>
-        <w:t>Professional certificate (postgraduate short course)</w:t>
+        <w:t>Uganda Advanced Certificate of Education (A-Level)</w:t>
+      </w:r>
+    </w:p>
+    <w:p>
+      <w:pPr>
+        <w:spacing w:before="0" w:after="0"/>
+      </w:pPr>
+      <w:r>
+        <w:rPr>
+          <w:rFonts w:ascii="Calibri" w:hAnsi="Calibri"/>
+          <w:b/>
+          <w:sz w:val="21"/>
+        </w:rPr>
+        <w:t>Mengo Secondary School</w:t>
+      </w:r>
+    </w:p>
+    <w:p>
+      <w:pPr>
+        <w:spacing w:after="40" w:before="0" w:line="276" w:lineRule="auto"/>
+      </w:pPr>
+      <w:r>
+        <w:rPr>
+          <w:rFonts w:ascii="Calibri" w:hAnsi="Calibri"/>
+          <w:color w:val="2F2F2F"/>
+          <w:sz w:val="21"/>
+        </w:rPr>
+        <w:t>UACE 2011. Principal: Mathematics (B), Physics (B), Biology (B), Chemistry (D). Subsidiary: General Paper (4).</w:t>
+      </w:r>
+    </w:p>
+    <w:p>
+      <w:pPr>
+        <w:spacing w:before="80" w:after="20"/>
+      </w:pPr>
+      <w:r>
+        <w:rPr>
+          <w:rFonts w:ascii="Calibri" w:hAnsi="Calibri"/>
+          <w:b/>
+          <w:color w:val="1A6B5C"/>
+          <w:sz w:val="20"/>
+        </w:rPr>
+        <w:t>Uganda Certificate of Education (O-Level)</w:t>
+      </w:r>
+    </w:p>
+    <w:p>
+      <w:pPr>
+        <w:spacing w:before="0" w:after="0"/>
+      </w:pPr>
+      <w:r>
+        <w:rPr>
+          <w:rFonts w:ascii="Calibri" w:hAnsi="Calibri"/>
+          <w:b/>
+          <w:sz w:val="21"/>
+        </w:rPr>
+        <w:t>St. John's Wakiso Secondary School</w:t>
+      </w:r>
+    </w:p>
+    <w:p>
+      <w:pPr>
+        <w:spacing w:after="40" w:before="0" w:line="276" w:lineRule="auto"/>
+      </w:pPr>
+      <w:r>
+        <w:rPr>
+          <w:rFonts w:ascii="Calibri" w:hAnsi="Calibri"/>
+          <w:color w:val="2F2F2F"/>
+          <w:sz w:val="21"/>
+        </w:rPr>
+        <w:t>UCE 2009. Division I. Passed 10 of 10 subjects, including Distinctions in Mathematics (1), Physics (1), and Biology (2).</w:t>
+      </w:r>
+    </w:p>
+    <w:p>
+      <w:pPr>
+        <w:spacing w:before="200" w:after="80"/>
+        <w:pBdr>
+          <w:bottom w:val="single" w:sz="12" w:space="1" w:color="1A6B5C"/>
+        </w:pBdr>
+      </w:pPr>
+      <w:r>
+        <w:rPr>
+          <w:rFonts w:ascii="Calibri" w:hAnsi="Calibri"/>
+          <w:b/>
+          <w:color w:val="0F2C4C"/>
+          <w:sz w:val="21"/>
+        </w:rPr>
+        <w:t>CERTIFICATES AND SHORT COURSES</w:t>
+      </w:r>
+    </w:p>
+    <w:p>
+      <w:pPr>
+        <w:spacing w:before="80" w:after="20"/>
+      </w:pPr>
+      <w:r>
+        <w:rPr>
+          <w:rFonts w:ascii="Calibri" w:hAnsi="Calibri"/>
+          <w:b/>
+          <w:color w:val="1A6B5C"/>
+          <w:sz w:val="20"/>
+        </w:rPr>
+        <w:t>Professional development certificate</w:t>
       </w:r>
     </w:p>
     <w:p>
@@ -947,7 +1044,7 @@
           <w:color w:val="2F2F2F"/>
           <w:sz w:val="21"/>
         </w:rPr>
-        <w:t>Certificate in Leadership and Management in Health, 2022 - Grade: A+</w:t>
+        <w:t>Leadership and Management in Health (Professional Development), December 2022. 7.5 Continuing Education Units (CEUs).</w:t>
       </w:r>
     </w:p>
     <w:p>
@@ -961,7 +1058,7 @@
           <w:color w:val="1A6B5C"/>
           <w:sz w:val="20"/>
         </w:rPr>
-        <w:t>Advanced professional certificate</w:t>
+        <w:t>Technical certificate</w:t>
       </w:r>
     </w:p>
     <w:p>
@@ -974,7 +1071,7 @@
           <w:b/>
           <w:sz w:val="21"/>
         </w:rPr>
-        <w:t>Green Bridge School of Open Technology</w:t>
+        <w:t>Greenbridge School of Open Technologies</w:t>
       </w:r>
     </w:p>
     <w:p>
@@ -987,7 +1084,47 @@
           <w:color w:val="2F2F2F"/>
           <w:sz w:val="21"/>
         </w:rPr>
-        <w:t>Advanced Java Programming, 2016 - Grade: A+</w:t>
+        <w:t>Certificate in JAVA Programming - Level 1, 1 Dec 2015 - 22 Jan 2016. Grade: A+.</w:t>
+      </w:r>
+    </w:p>
+    <w:p>
+      <w:pPr>
+        <w:spacing w:before="80" w:after="20"/>
+      </w:pPr>
+      <w:r>
+        <w:rPr>
+          <w:rFonts w:ascii="Calibri" w:hAnsi="Calibri"/>
+          <w:b/>
+          <w:color w:val="1A6B5C"/>
+          <w:sz w:val="20"/>
+        </w:rPr>
+        <w:t>Workplace safety training</w:t>
+      </w:r>
+    </w:p>
+    <w:p>
+      <w:pPr>
+        <w:spacing w:before="0" w:after="0"/>
+      </w:pPr>
+      <w:r>
+        <w:rPr>
+          <w:rFonts w:ascii="Calibri" w:hAnsi="Calibri"/>
+          <w:b/>
+          <w:sz w:val="21"/>
+        </w:rPr>
+        <w:t>Fire Technologies Limited (at International Hospital Kampala)</w:t>
+      </w:r>
+    </w:p>
+    <w:p>
+      <w:pPr>
+        <w:spacing w:after="40" w:before="0" w:line="276" w:lineRule="auto"/>
+      </w:pPr>
+      <w:r>
+        <w:rPr>
+          <w:rFonts w:ascii="Calibri" w:hAnsi="Calibri"/>
+          <w:color w:val="2F2F2F"/>
+          <w:sz w:val="21"/>
+        </w:rPr>
+        <w:t>General fire safety, fire prevention, firefighting, emergency scene management, and evacuation with live drills, 8-9 April 2021. Cert. No. FTL/IHK/05052021.</w:t>
       </w:r>
     </w:p>
     <w:p>

</xml_diff>

<commit_message>
Highlight lab haematology, chemistry, and blood bank work plus East Africa field countries on the Medequip application.
Co-authored-by: Cursor <cursoragent@cursor.com>
</commit_message>
<xml_diff>
--- a/wilson/medequip-rwanda/Wasswa_Wilson_CV_Medequip_Biomedical_Engineer.docx
+++ b/wilson/medequip-rwanda/Wasswa_Wilson_CV_Medequip_Biomedical_Engineer.docx
@@ -113,7 +113,7 @@
           <w:color w:val="2F2F2F"/>
           <w:sz w:val="21"/>
         </w:rPr>
-        <w:t>I am a biomedical engineer with over 7 years installing, commissioning, maintaining, and training users on hospital equipment. Most of that time was inside busy hospitals in Uganda. Since early 2025 I have also worked on personal contracts, including lab, theatre, and radiology installs at hospitals in the Democratic Republic of Congo - one of them serves the Kibali Gold Mine. I am used to travelling for service jobs, working on my own on site, writing clear service notes, and teaching clinical staff how to use and care for the machines. I want to bring that field experience to Medequip's clients across Rwanda and the region.</w:t>
+        <w:t>I am a biomedical engineer with over 7 years installing, commissioning, maintaining, and training users on hospital equipment. I have done this work in Uganda, Congo, Kenya, Tanzania, and Somaliland. My experience covers radiology, theatre, ICU, and laboratory systems - including haematology analysers, chemistry analysers, and blood bank machines. Since early 2025 I have also worked on personal contracts, including lab, theatre, and radiology installs in Congo (among them the hospital that serves the Kibali Gold Mine). I am used to travelling for service jobs, working alone on site, writing clear service notes, and teaching clinical staff how to use and care for the machines. I want to bring that regional field experience to Medequip's clients across Rwanda and beyond.</w:t>
       </w:r>
     </w:p>
     <w:p>
@@ -172,7 +172,28 @@
           <w:color w:val="2F2F2F"/>
           <w:sz w:val="20"/>
         </w:rPr>
-        <w:t>Radiology (X-ray, CT, ultrasound, C-arm); theatre and ICU (ventilators, monitors, infusion pumps, theatre systems); lab analysers and support plant (blood bank, RO water, oxygen)</w:t>
+        <w:t>Radiology (X-ray, CT, ultrasound, C-arm); theatre and ICU (ventilators, monitors, infusion pumps, theatre systems); laboratory (haematology analysers, chemistry analysers, blood bank machines); support plant (RO water, oxygen)</w:t>
+      </w:r>
+    </w:p>
+    <w:p>
+      <w:pPr>
+        <w:spacing w:after="60" w:line="264" w:lineRule="auto"/>
+      </w:pPr>
+      <w:r>
+        <w:rPr>
+          <w:rFonts w:ascii="Calibri" w:hAnsi="Calibri"/>
+          <w:b/>
+          <w:color w:val="0F2C4C"/>
+          <w:sz w:val="20"/>
+        </w:rPr>
+        <w:t xml:space="preserve">Countries worked: </w:t>
+      </w:r>
+      <w:r>
+        <w:rPr>
+          <w:color w:val="2F2F2F"/>
+          <w:sz w:val="20"/>
+        </w:rPr>
+        <w:t>Uganda, Democratic Republic of Congo, Kenya, Tanzania, and Somaliland - field installs, maintenance, and user training</w:t>
       </w:r>
     </w:p>
     <w:p>
@@ -269,7 +290,7 @@
           <w:color w:val="2F2F2F"/>
           <w:sz w:val="20"/>
         </w:rPr>
-        <w:t>Install and maintain medical equipment for hospitals on a personal-contract basis after leaving GFF.</w:t>
+        <w:t>Install and maintain medical equipment for hospitals on a personal-contract basis after leaving GFF, including field work in Uganda, Congo, Kenya, Tanzania, and Somaliland.</w:t>
       </w:r>
     </w:p>
     <w:p>
@@ -284,7 +305,7 @@
           <w:color w:val="2F2F2F"/>
           <w:sz w:val="20"/>
         </w:rPr>
-        <w:t>Completed lab, theatre, and radiology installations at several hospitals in the Democratic Republic of Congo, including the hospital that serves the Kibali Gold Mine.</w:t>
+        <w:t>Completed lab, theatre, and radiology installations at several hospitals in Congo, including the hospital that serves the Kibali Gold Mine.</w:t>
       </w:r>
     </w:p>
     <w:p>
@@ -299,7 +320,7 @@
           <w:color w:val="2F2F2F"/>
           <w:sz w:val="20"/>
         </w:rPr>
-        <w:t>Handle preventive and corrective maintenance, on-site troubleshooting, and basic user training after handover.</w:t>
+        <w:t>Lab installs and support cover haematology analysers, chemistry analysers, and blood bank machines, plus user handover.</w:t>
       </w:r>
     </w:p>
     <w:p>
@@ -314,7 +335,7 @@
           <w:color w:val="2F2F2F"/>
           <w:sz w:val="20"/>
         </w:rPr>
-        <w:t>Work independently on travel assignments and report back clearly to the client after each job.</w:t>
+        <w:t>Handle preventive and corrective maintenance, on-site troubleshooting, and clear client reporting after each job.</w:t>
       </w:r>
     </w:p>
     <w:p>
@@ -673,7 +694,7 @@
           <w:color w:val="2F2F2F"/>
           <w:sz w:val="20"/>
         </w:rPr>
-        <w:t>7+ years of hands-on hospital biomedical work across Uganda and Congo.</w:t>
+        <w:t>Field biomedical work in Uganda, Congo, Kenya, Tanzania, and Somaliland.</w:t>
       </w:r>
     </w:p>
     <w:p>
@@ -688,7 +709,7 @@
           <w:color w:val="2F2F2F"/>
           <w:sz w:val="20"/>
         </w:rPr>
-        <w:t>Installed lab, theatre, and radiology equipment for hospitals in Congo, including the facility serving Kibali Gold Mine.</w:t>
+        <w:t>Installed and supported haematology, chemistry, and blood bank laboratory machines alongside theatre and radiology systems.</w:t>
       </w:r>
     </w:p>
     <w:p>
@@ -703,7 +724,7 @@
           <w:color w:val="2F2F2F"/>
           <w:sz w:val="20"/>
         </w:rPr>
-        <w:t>Commissioned critical systems in Uganda such as CT, X-ray, oxygen plant, and ICU technologies.</w:t>
+        <w:t>Congo installs include the hospital serving Kibali Gold Mine.</w:t>
       </w:r>
     </w:p>
     <w:p>
@@ -718,22 +739,7 @@
           <w:color w:val="2F2F2F"/>
           <w:sz w:val="20"/>
         </w:rPr>
-        <w:t>Helped IHK through COHSASA accreditation on the biomedical side.</w:t>
-      </w:r>
-    </w:p>
-    <w:p>
-      <w:pPr>
-        <w:pStyle w:val="ListBullet"/>
-        <w:spacing w:after="40" w:before="0" w:line="264" w:lineRule="auto"/>
-        <w:ind w:left="288"/>
-      </w:pPr>
-      <w:r>
-        <w:rPr>
-          <w:rFonts w:ascii="Calibri" w:hAnsi="Calibri"/>
-          <w:color w:val="2F2F2F"/>
-          <w:sz w:val="20"/>
-        </w:rPr>
-        <w:t>Trained engineers, technicians, and clinical users so equipment stays useful after install day.</w:t>
+        <w:t>Commissioned CT, X-ray, oxygen plant, and ICU systems in Uganda; supported COHSASA accreditation at IHK.</w:t>
       </w:r>
     </w:p>
     <w:p>
@@ -810,7 +816,7 @@
         <w:rPr>
           <w:sz w:val="20"/>
         </w:rPr>
-        <w:t>Haematology and chemistry analysers, blood bank systems</w:t>
+        <w:t>Haematology analysers; clinical chemistry analysers; blood bank machines and transfusion support systems</w:t>
       </w:r>
     </w:p>
     <w:p>
@@ -907,7 +913,7 @@
           <w:color w:val="2F2F2F"/>
           <w:sz w:val="21"/>
         </w:rPr>
-        <w:t>BSc Biomedical Engineering (BBIO). Second Class Honours - Upper Division. CGPA 3.69 / 5.0. 173 credit units. Studied 2012-2016 (completed May/June 2016). Reg. No. 12/U/15375/PS.</w:t>
+        <w:t>BSc Biomedical Engineering. Second Class Honours - Upper Division (CGPA 3.69 / 5.0). 2012-2016.</w:t>
       </w:r>
     </w:p>
     <w:p>
@@ -947,7 +953,7 @@
           <w:color w:val="2F2F2F"/>
           <w:sz w:val="21"/>
         </w:rPr>
-        <w:t>UACE 2011. Principal: Mathematics (B), Physics (B), Biology (B), Chemistry (D). Subsidiary: General Paper (4).</w:t>
+        <w:t>UACE 2011. Principal: Mathematics (B), Physics (B), Biology (B), Chemistry (D).</w:t>
       </w:r>
     </w:p>
     <w:p>
@@ -987,7 +993,7 @@
           <w:color w:val="2F2F2F"/>
           <w:sz w:val="21"/>
         </w:rPr>
-        <w:t>UCE 2009. Division I. Passed 10 of 10 subjects, including Distinctions in Mathematics (1), Physics (1), and Biology (2).</w:t>
+        <w:t>UCE 2009. Division I. Distinctions in Mathematics (1), Physics (1), and Biology (2).</w:t>
       </w:r>
     </w:p>
     <w:p>
@@ -1044,7 +1050,7 @@
           <w:color w:val="2F2F2F"/>
           <w:sz w:val="21"/>
         </w:rPr>
-        <w:t>Leadership and Management in Health (Professional Development), December 2022. 7.5 Continuing Education Units (CEUs).</w:t>
+        <w:t>Leadership and Management in Health, December 2022 (7.5 CEUs).</w:t>
       </w:r>
     </w:p>
     <w:p>
@@ -1084,7 +1090,7 @@
           <w:color w:val="2F2F2F"/>
           <w:sz w:val="21"/>
         </w:rPr>
-        <w:t>Certificate in JAVA Programming - Level 1, 1 Dec 2015 - 22 Jan 2016. Grade: A+.</w:t>
+        <w:t>JAVA Programming - Level 1, Dec 2015 - Jan 2016. Grade: A+.</w:t>
       </w:r>
     </w:p>
     <w:p>
@@ -1111,7 +1117,7 @@
           <w:b/>
           <w:sz w:val="21"/>
         </w:rPr>
-        <w:t>Fire Technologies Limited (at International Hospital Kampala)</w:t>
+        <w:t>Fire Technologies Limited (IHK)</w:t>
       </w:r>
     </w:p>
     <w:p>
@@ -1124,7 +1130,7 @@
           <w:color w:val="2F2F2F"/>
           <w:sz w:val="21"/>
         </w:rPr>
-        <w:t>General fire safety, fire prevention, firefighting, emergency scene management, and evacuation with live drills, 8-9 April 2021. Cert. No. FTL/IHK/05052021.</w:t>
+        <w:t>Fire safety, prevention, firefighting, and evacuation drills, April 2021.</w:t>
       </w:r>
     </w:p>
     <w:p>

</xml_diff>

<commit_message>
Remove grades and scores from Medequip CV academic qualifications.
Co-authored-by: Cursor <cursoragent@cursor.com>
</commit_message>
<xml_diff>
--- a/wilson/medequip-rwanda/Wasswa_Wilson_CV_Medequip_Biomedical_Engineer.docx
+++ b/wilson/medequip-rwanda/Wasswa_Wilson_CV_Medequip_Biomedical_Engineer.docx
@@ -913,7 +913,7 @@
           <w:color w:val="2F2F2F"/>
           <w:sz w:val="21"/>
         </w:rPr>
-        <w:t>BSc Biomedical Engineering. Second Class Honours - Upper Division (CGPA 3.69 / 5.0). 2012-2016.</w:t>
+        <w:t>BSc Biomedical Engineering, 2012-2016.</w:t>
       </w:r>
     </w:p>
     <w:p>
@@ -953,7 +953,7 @@
           <w:color w:val="2F2F2F"/>
           <w:sz w:val="21"/>
         </w:rPr>
-        <w:t>UACE 2011. Principal: Mathematics (B), Physics (B), Biology (B), Chemistry (D).</w:t>
+        <w:t>UACE 2011. Principal subjects: Mathematics, Physics, Biology, and Chemistry.</w:t>
       </w:r>
     </w:p>
     <w:p>
@@ -993,7 +993,7 @@
           <w:color w:val="2F2F2F"/>
           <w:sz w:val="21"/>
         </w:rPr>
-        <w:t>UCE 2009. Division I. Distinctions in Mathematics (1), Physics (1), and Biology (2).</w:t>
+        <w:t>UCE 2009.</w:t>
       </w:r>
     </w:p>
     <w:p>
@@ -1050,7 +1050,7 @@
           <w:color w:val="2F2F2F"/>
           <w:sz w:val="21"/>
         </w:rPr>
-        <w:t>Leadership and Management in Health, December 2022 (7.5 CEUs).</w:t>
+        <w:t>Leadership and Management in Health, December 2022.</w:t>
       </w:r>
     </w:p>
     <w:p>
@@ -1090,7 +1090,7 @@
           <w:color w:val="2F2F2F"/>
           <w:sz w:val="21"/>
         </w:rPr>
-        <w:t>JAVA Programming - Level 1, Dec 2015 - Jan 2016. Grade: A+.</w:t>
+        <w:t>JAVA Programming - Level 1, Dec 2015 - Jan 2016.</w:t>
       </w:r>
     </w:p>
     <w:p>

</xml_diff>

<commit_message>
Add Page x of y footers and improve Medequip application readability and IHK install detail.
Co-authored-by: Cursor <cursoragent@cursor.com>
</commit_message>
<xml_diff>
--- a/wilson/medequip-rwanda/Wasswa_Wilson_CV_Medequip_Biomedical_Engineer.docx
+++ b/wilson/medequip-rwanda/Wasswa_Wilson_CV_Medequip_Biomedical_Engineer.docx
@@ -12,7 +12,7 @@
           <w:rFonts w:ascii="Calibri" w:hAnsi="Calibri"/>
           <w:b/>
           <w:color w:val="0F2C4C"/>
-          <w:sz w:val="36"/>
+          <w:sz w:val="40"/>
         </w:rPr>
         <w:t>WASSWA WILSON</w:t>
       </w:r>
@@ -27,7 +27,7 @@
           <w:rFonts w:ascii="Calibri" w:hAnsi="Calibri"/>
           <w:b/>
           <w:color w:val="1A6B5C"/>
-          <w:sz w:val="22"/>
+          <w:sz w:val="24"/>
         </w:rPr>
         <w:t>Biomedical Engineer</w:t>
       </w:r>
@@ -42,7 +42,7 @@
           <w:rFonts w:ascii="Calibri" w:hAnsi="Calibri"/>
           <w:b/>
           <w:color w:val="1A6B5C"/>
-          <w:sz w:val="20"/>
+          <w:sz w:val="22"/>
         </w:rPr>
         <w:t>7+ years in biomedical equipment work</w:t>
       </w:r>
@@ -55,7 +55,7 @@
       <w:r>
         <w:rPr>
           <w:color w:val="444444"/>
-          <w:sz w:val="19"/>
+          <w:sz w:val="21"/>
         </w:rPr>
         <w:t>wasswawilson0001@gmail.com  ·  +256783230321</w:t>
       </w:r>
@@ -68,7 +68,7 @@
       <w:r>
         <w:rPr>
           <w:color w:val="555555"/>
-          <w:sz w:val="18"/>
+          <w:sz w:val="20"/>
         </w:rPr>
         <w:t>Kampala, Uganda | Ready for Kigali</w:t>
       </w:r>
@@ -81,7 +81,7 @@
       <w:r>
         <w:rPr>
           <w:color w:val="555555"/>
-          <w:sz w:val="18"/>
+          <w:sz w:val="20"/>
         </w:rPr>
         <w:t>English (fluent) · Luganda (native)</w:t>
       </w:r>
@@ -98,7 +98,7 @@
           <w:rFonts w:ascii="Calibri" w:hAnsi="Calibri"/>
           <w:b/>
           <w:color w:val="0F2C4C"/>
-          <w:sz w:val="21"/>
+          <w:sz w:val="23"/>
         </w:rPr>
         <w:t>PROFILE</w:t>
       </w:r>
@@ -111,9 +111,9 @@
         <w:rPr>
           <w:rFonts w:ascii="Calibri" w:hAnsi="Calibri"/>
           <w:color w:val="2F2F2F"/>
-          <w:sz w:val="21"/>
+          <w:sz w:val="22"/>
         </w:rPr>
-        <w:t>I am a biomedical engineer with over 7 years installing, commissioning, maintaining, and training users on hospital equipment. I have done this work in Uganda, Congo, Kenya, Tanzania, and Somaliland. My experience covers radiology, theatre, ICU, and laboratory systems - including haematology analysers, chemistry analysers, and blood bank machines. Since early 2025 I have also worked on personal contracts, including lab, theatre, and radiology installs in Congo (among them the hospital that serves the Kibali Gold Mine). I am used to travelling for service jobs, working alone on site, writing clear service notes, and teaching clinical staff how to use and care for the machines. I want to bring that regional field experience to Medequip's clients across Rwanda and beyond.</w:t>
+        <w:t>I am a biomedical engineer with over 7 years installing, commissioning, maintaining, and training users on hospital equipment across Uganda, Congo, Kenya, Tanzania, and Somaliland. At International Hospital Kampala I led equipment installs across laboratory, theatre, ICU, and radiology - including haematology, chemistry, and blood bank machines. Since early 2025 I have also worked on personal contracts, including Congo installs at the hospital serving Kibali Gold Mine. I travel for service jobs, work independently on site, write clear service notes, and train clinical staff. I want to bring that field experience to Medequip's clients across Rwanda and beyond.</w:t>
       </w:r>
     </w:p>
     <w:p>
@@ -128,7 +128,7 @@
           <w:rFonts w:ascii="Calibri" w:hAnsi="Calibri"/>
           <w:b/>
           <w:color w:val="0F2C4C"/>
-          <w:sz w:val="21"/>
+          <w:sz w:val="23"/>
         </w:rPr>
         <w:t>SKILLS FOR THIS JOB</w:t>
       </w:r>
@@ -142,14 +142,14 @@
           <w:rFonts w:ascii="Calibri" w:hAnsi="Calibri"/>
           <w:b/>
           <w:color w:val="0F2C4C"/>
-          <w:sz w:val="20"/>
+          <w:sz w:val="22"/>
         </w:rPr>
         <w:t xml:space="preserve">What I do on site: </w:t>
       </w:r>
       <w:r>
         <w:rPr>
           <w:color w:val="2F2F2F"/>
-          <w:sz w:val="20"/>
+          <w:sz w:val="22"/>
         </w:rPr>
         <w:t>Install, calibrate, commission, prevent faults, fix breakdowns, and hand over equipment ready for clinical use</w:t>
       </w:r>
@@ -163,14 +163,14 @@
           <w:rFonts w:ascii="Calibri" w:hAnsi="Calibri"/>
           <w:b/>
           <w:color w:val="0F2C4C"/>
-          <w:sz w:val="20"/>
+          <w:sz w:val="22"/>
         </w:rPr>
         <w:t xml:space="preserve">Equipment I know well: </w:t>
       </w:r>
       <w:r>
         <w:rPr>
           <w:color w:val="2F2F2F"/>
-          <w:sz w:val="20"/>
+          <w:sz w:val="22"/>
         </w:rPr>
         <w:t>Radiology (X-ray, CT, ultrasound, C-arm); theatre and ICU (ventilators, monitors, infusion pumps, theatre systems); laboratory (haematology analysers, chemistry analysers, blood bank machines); support plant (RO water, oxygen)</w:t>
       </w:r>
@@ -184,35 +184,14 @@
           <w:rFonts w:ascii="Calibri" w:hAnsi="Calibri"/>
           <w:b/>
           <w:color w:val="0F2C4C"/>
-          <w:sz w:val="20"/>
-        </w:rPr>
-        <w:t xml:space="preserve">Countries worked: </w:t>
-      </w:r>
-      <w:r>
-        <w:rPr>
-          <w:color w:val="2F2F2F"/>
-          <w:sz w:val="20"/>
-        </w:rPr>
-        <w:t>Uganda, Democratic Republic of Congo, Kenya, Tanzania, and Somaliland - field installs, maintenance, and user training</w:t>
-      </w:r>
-    </w:p>
-    <w:p>
-      <w:pPr>
-        <w:spacing w:after="60" w:line="264" w:lineRule="auto"/>
-      </w:pPr>
-      <w:r>
-        <w:rPr>
-          <w:rFonts w:ascii="Calibri" w:hAnsi="Calibri"/>
-          <w:b/>
-          <w:color w:val="0F2C4C"/>
-          <w:sz w:val="20"/>
+          <w:sz w:val="22"/>
         </w:rPr>
         <w:t xml:space="preserve">Client support: </w:t>
       </w:r>
       <w:r>
         <w:rPr>
           <w:color w:val="2F2F2F"/>
-          <w:sz w:val="20"/>
+          <w:sz w:val="22"/>
         </w:rPr>
         <w:t>User training, procurement and commissioning support, service reports, maintenance logs, accreditation paperwork</w:t>
       </w:r>
@@ -226,14 +205,14 @@
           <w:rFonts w:ascii="Calibri" w:hAnsi="Calibri"/>
           <w:b/>
           <w:color w:val="0F2C4C"/>
-          <w:sz w:val="20"/>
+          <w:sz w:val="22"/>
         </w:rPr>
         <w:t xml:space="preserve">How I work: </w:t>
       </w:r>
       <w:r>
         <w:rPr>
           <w:color w:val="2F2F2F"/>
-          <w:sz w:val="20"/>
+          <w:sz w:val="22"/>
         </w:rPr>
         <w:t>Clear spoken English, independent field work, cross-border travel, quick learner on new brands and models</w:t>
       </w:r>
@@ -250,21 +229,21 @@
           <w:rFonts w:ascii="Calibri" w:hAnsi="Calibri"/>
           <w:b/>
           <w:color w:val="0F2C4C"/>
-          <w:sz w:val="21"/>
+          <w:sz w:val="23"/>
         </w:rPr>
         <w:t>WORK EXPERIENCE</w:t>
       </w:r>
     </w:p>
     <w:p>
       <w:pPr>
-        <w:spacing w:before="160" w:after="40"/>
+        <w:spacing w:before="140" w:after="40"/>
       </w:pPr>
       <w:r>
         <w:rPr>
           <w:rFonts w:ascii="Calibri" w:hAnsi="Calibri"/>
           <w:b/>
           <w:color w:val="1A1A1A"/>
-          <w:sz w:val="21"/>
+          <w:sz w:val="22"/>
         </w:rPr>
         <w:t>Independent Biomedical Engineer (personal contracts)</w:t>
       </w:r>
@@ -273,7 +252,7 @@
           <w:rFonts w:ascii="Calibri" w:hAnsi="Calibri"/>
           <w:i/>
           <w:color w:val="1A6B5C"/>
-          <w:sz w:val="18"/>
+          <w:sz w:val="20"/>
         </w:rPr>
         <w:t xml:space="preserve">  |  Mar 2025 - Present</w:t>
       </w:r>
@@ -281,14 +260,14 @@
     <w:p>
       <w:pPr>
         <w:pStyle w:val="ListBullet"/>
-        <w:spacing w:after="40" w:before="0" w:line="264" w:lineRule="auto"/>
+        <w:spacing w:after="40" w:before="0" w:line="269" w:lineRule="auto"/>
         <w:ind w:left="288"/>
       </w:pPr>
       <w:r>
         <w:rPr>
           <w:rFonts w:ascii="Calibri" w:hAnsi="Calibri"/>
           <w:color w:val="2F2F2F"/>
-          <w:sz w:val="20"/>
+          <w:sz w:val="22"/>
         </w:rPr>
         <w:t>Install and maintain medical equipment for hospitals on a personal-contract basis after leaving GFF, including field work in Uganda, Congo, Kenya, Tanzania, and Somaliland.</w:t>
       </w:r>
@@ -296,14 +275,14 @@
     <w:p>
       <w:pPr>
         <w:pStyle w:val="ListBullet"/>
-        <w:spacing w:after="40" w:before="0" w:line="264" w:lineRule="auto"/>
+        <w:spacing w:after="40" w:before="0" w:line="269" w:lineRule="auto"/>
         <w:ind w:left="288"/>
       </w:pPr>
       <w:r>
         <w:rPr>
           <w:rFonts w:ascii="Calibri" w:hAnsi="Calibri"/>
           <w:color w:val="2F2F2F"/>
-          <w:sz w:val="20"/>
+          <w:sz w:val="22"/>
         </w:rPr>
         <w:t>Completed lab, theatre, and radiology installations at several hospitals in Congo, including the hospital that serves the Kibali Gold Mine.</w:t>
       </w:r>
@@ -311,14 +290,14 @@
     <w:p>
       <w:pPr>
         <w:pStyle w:val="ListBullet"/>
-        <w:spacing w:after="40" w:before="0" w:line="264" w:lineRule="auto"/>
+        <w:spacing w:after="40" w:before="0" w:line="269" w:lineRule="auto"/>
         <w:ind w:left="288"/>
       </w:pPr>
       <w:r>
         <w:rPr>
           <w:rFonts w:ascii="Calibri" w:hAnsi="Calibri"/>
           <w:color w:val="2F2F2F"/>
-          <w:sz w:val="20"/>
+          <w:sz w:val="22"/>
         </w:rPr>
         <w:t>Lab installs and support cover haematology analysers, chemistry analysers, and blood bank machines, plus user handover.</w:t>
       </w:r>
@@ -326,28 +305,28 @@
     <w:p>
       <w:pPr>
         <w:pStyle w:val="ListBullet"/>
-        <w:spacing w:after="40" w:before="0" w:line="264" w:lineRule="auto"/>
+        <w:spacing w:after="40" w:before="0" w:line="269" w:lineRule="auto"/>
         <w:ind w:left="288"/>
       </w:pPr>
       <w:r>
         <w:rPr>
           <w:rFonts w:ascii="Calibri" w:hAnsi="Calibri"/>
           <w:color w:val="2F2F2F"/>
-          <w:sz w:val="20"/>
+          <w:sz w:val="22"/>
         </w:rPr>
         <w:t>Handle preventive and corrective maintenance, on-site troubleshooting, and clear client reporting after each job.</w:t>
       </w:r>
     </w:p>
     <w:p>
       <w:pPr>
-        <w:spacing w:before="160" w:after="40"/>
+        <w:spacing w:before="140" w:after="40"/>
       </w:pPr>
       <w:r>
         <w:rPr>
           <w:rFonts w:ascii="Calibri" w:hAnsi="Calibri"/>
           <w:b/>
           <w:color w:val="1A1A1A"/>
-          <w:sz w:val="21"/>
+          <w:sz w:val="22"/>
         </w:rPr>
         <w:t>Biomedical Programs Manager, Gould Family Foundation (GFF)</w:t>
       </w:r>
@@ -356,7 +335,7 @@
           <w:rFonts w:ascii="Calibri" w:hAnsi="Calibri"/>
           <w:i/>
           <w:color w:val="1A6B5C"/>
-          <w:sz w:val="18"/>
+          <w:sz w:val="20"/>
         </w:rPr>
         <w:t xml:space="preserve">  |  Aug 2024 - Feb 2025</w:t>
       </w:r>
@@ -364,14 +343,14 @@
     <w:p>
       <w:pPr>
         <w:pStyle w:val="ListBullet"/>
-        <w:spacing w:after="40" w:before="0" w:line="264" w:lineRule="auto"/>
+        <w:spacing w:after="40" w:before="0" w:line="269" w:lineRule="auto"/>
         <w:ind w:left="288"/>
       </w:pPr>
       <w:r>
         <w:rPr>
           <w:rFonts w:ascii="Calibri" w:hAnsi="Calibri"/>
           <w:color w:val="2F2F2F"/>
-          <w:sz w:val="20"/>
+          <w:sz w:val="22"/>
         </w:rPr>
         <w:t>Ran biomedical programmes across several health facilities.</w:t>
       </w:r>
@@ -379,14 +358,14 @@
     <w:p>
       <w:pPr>
         <w:pStyle w:val="ListBullet"/>
-        <w:spacing w:after="40" w:before="0" w:line="264" w:lineRule="auto"/>
+        <w:spacing w:after="40" w:before="0" w:line="269" w:lineRule="auto"/>
         <w:ind w:left="288"/>
       </w:pPr>
       <w:r>
         <w:rPr>
           <w:rFonts w:ascii="Calibri" w:hAnsi="Calibri"/>
           <w:color w:val="2F2F2F"/>
-          <w:sz w:val="20"/>
+          <w:sz w:val="22"/>
         </w:rPr>
         <w:t>Supported buying, installing, and commissioning medical equipment.</w:t>
       </w:r>
@@ -394,28 +373,28 @@
     <w:p>
       <w:pPr>
         <w:pStyle w:val="ListBullet"/>
-        <w:spacing w:after="40" w:before="0" w:line="264" w:lineRule="auto"/>
+        <w:spacing w:after="40" w:before="0" w:line="269" w:lineRule="auto"/>
         <w:ind w:left="288"/>
       </w:pPr>
       <w:r>
         <w:rPr>
           <w:rFonts w:ascii="Calibri" w:hAnsi="Calibri"/>
           <w:color w:val="2F2F2F"/>
-          <w:sz w:val="20"/>
+          <w:sz w:val="22"/>
         </w:rPr>
         <w:t>Trained engineers and technicians, and kept work in line with healthcare technology standards.</w:t>
       </w:r>
     </w:p>
     <w:p>
       <w:pPr>
-        <w:spacing w:before="160" w:after="40"/>
+        <w:spacing w:before="140" w:after="40"/>
       </w:pPr>
       <w:r>
         <w:rPr>
           <w:rFonts w:ascii="Calibri" w:hAnsi="Calibri"/>
           <w:b/>
           <w:color w:val="1A1A1A"/>
-          <w:sz w:val="21"/>
+          <w:sz w:val="22"/>
         </w:rPr>
         <w:t>Biomedical Manager, International Hospital Kampala (IHK)</w:t>
       </w:r>
@@ -424,7 +403,7 @@
           <w:rFonts w:ascii="Calibri" w:hAnsi="Calibri"/>
           <w:i/>
           <w:color w:val="1A6B5C"/>
-          <w:sz w:val="18"/>
+          <w:sz w:val="20"/>
         </w:rPr>
         <w:t xml:space="preserve">  |  Jan 2020 - Jan 2024</w:t>
       </w:r>
@@ -432,88 +411,58 @@
     <w:p>
       <w:pPr>
         <w:pStyle w:val="ListBullet"/>
-        <w:spacing w:after="40" w:before="0" w:line="264" w:lineRule="auto"/>
+        <w:spacing w:after="40" w:before="0" w:line="269" w:lineRule="auto"/>
         <w:ind w:left="288"/>
       </w:pPr>
       <w:r>
         <w:rPr>
           <w:rFonts w:ascii="Calibri" w:hAnsi="Calibri"/>
           <w:color w:val="2F2F2F"/>
-          <w:sz w:val="20"/>
+          <w:sz w:val="22"/>
         </w:rPr>
-        <w:t>Looked after biomedical engineering for a major private hospital for four years.</w:t>
+        <w:t>Managed biomedical engineering for a major private hospital for four years.</w:t>
       </w:r>
     </w:p>
     <w:p>
       <w:pPr>
         <w:pStyle w:val="ListBullet"/>
-        <w:spacing w:after="40" w:before="0" w:line="264" w:lineRule="auto"/>
+        <w:spacing w:after="40" w:before="0" w:line="269" w:lineRule="auto"/>
         <w:ind w:left="288"/>
       </w:pPr>
       <w:r>
         <w:rPr>
           <w:rFonts w:ascii="Calibri" w:hAnsi="Calibri"/>
           <w:color w:val="2F2F2F"/>
-          <w:sz w:val="20"/>
+          <w:sz w:val="22"/>
         </w:rPr>
-        <w:t>Led installs and commissioning of CT scanners, oxygen plants, X-ray systems, and ICU equipment.</w:t>
+        <w:t>Led installation and commissioning across IHK laboratory, theatre, ICU, and radiology - including haematology, chemistry, and blood bank machines, plus CT, X-ray, and oxygen plant.</w:t>
       </w:r>
     </w:p>
     <w:p>
       <w:pPr>
         <w:pStyle w:val="ListBullet"/>
-        <w:spacing w:after="40" w:before="0" w:line="264" w:lineRule="auto"/>
+        <w:spacing w:after="40" w:before="0" w:line="269" w:lineRule="auto"/>
         <w:ind w:left="288"/>
       </w:pPr>
       <w:r>
         <w:rPr>
           <w:rFonts w:ascii="Calibri" w:hAnsi="Calibri"/>
           <w:color w:val="2F2F2F"/>
-          <w:sz w:val="20"/>
+          <w:sz w:val="22"/>
         </w:rPr>
-        <w:t>Set up preventive maintenance so machines stayed up and safe for patients.</w:t>
+        <w:t>Ran preventive maintenance, procurement support, service records, staff training, and COHSASA accreditation work.</w:t>
       </w:r>
     </w:p>
     <w:p>
       <w:pPr>
-        <w:pStyle w:val="ListBullet"/>
-        <w:spacing w:after="40" w:before="0" w:line="264" w:lineRule="auto"/>
-        <w:ind w:left="288"/>
-      </w:pPr>
-      <w:r>
-        <w:rPr>
-          <w:rFonts w:ascii="Calibri" w:hAnsi="Calibri"/>
-          <w:color w:val="2F2F2F"/>
-          <w:sz w:val="20"/>
-        </w:rPr>
-        <w:t>Helped with procurement, lifecycle planning, service records, and COHSASA accreditation work.</w:t>
-      </w:r>
-    </w:p>
-    <w:p>
-      <w:pPr>
-        <w:pStyle w:val="ListBullet"/>
-        <w:spacing w:after="40" w:before="0" w:line="264" w:lineRule="auto"/>
-        <w:ind w:left="288"/>
-      </w:pPr>
-      <w:r>
-        <w:rPr>
-          <w:rFonts w:ascii="Calibri" w:hAnsi="Calibri"/>
-          <w:color w:val="2F2F2F"/>
-          <w:sz w:val="20"/>
-        </w:rPr>
-        <w:t>Trained clinical and technical staff on correct use and care.</w:t>
-      </w:r>
-    </w:p>
-    <w:p>
-      <w:pPr>
-        <w:spacing w:before="160" w:after="40"/>
+        <w:spacing w:before="140" w:after="40"/>
       </w:pPr>
       <w:r>
         <w:rPr>
           <w:rFonts w:ascii="Calibri" w:hAnsi="Calibri"/>
           <w:b/>
           <w:color w:val="1A1A1A"/>
-          <w:sz w:val="21"/>
+          <w:sz w:val="22"/>
         </w:rPr>
         <w:t>Biomedical Engineer, Norvik Hospital Ltd</w:t>
       </w:r>
@@ -522,7 +471,7 @@
           <w:rFonts w:ascii="Calibri" w:hAnsi="Calibri"/>
           <w:i/>
           <w:color w:val="1A6B5C"/>
-          <w:sz w:val="18"/>
+          <w:sz w:val="20"/>
         </w:rPr>
         <w:t xml:space="preserve">  |  Apr 2019 - Jan 2020</w:t>
       </w:r>
@@ -530,14 +479,14 @@
     <w:p>
       <w:pPr>
         <w:pStyle w:val="ListBullet"/>
-        <w:spacing w:after="40" w:before="0" w:line="264" w:lineRule="auto"/>
+        <w:spacing w:after="40" w:before="0" w:line="269" w:lineRule="auto"/>
         <w:ind w:left="288"/>
       </w:pPr>
       <w:r>
         <w:rPr>
           <w:rFonts w:ascii="Calibri" w:hAnsi="Calibri"/>
           <w:color w:val="2F2F2F"/>
-          <w:sz w:val="20"/>
+          <w:sz w:val="22"/>
         </w:rPr>
         <w:t>Serviced diagnostic and monitoring equipment day to day.</w:t>
       </w:r>
@@ -545,14 +494,14 @@
     <w:p>
       <w:pPr>
         <w:pStyle w:val="ListBullet"/>
-        <w:spacing w:after="40" w:before="0" w:line="264" w:lineRule="auto"/>
+        <w:spacing w:after="40" w:before="0" w:line="269" w:lineRule="auto"/>
         <w:ind w:left="288"/>
       </w:pPr>
       <w:r>
         <w:rPr>
           <w:rFonts w:ascii="Calibri" w:hAnsi="Calibri"/>
           <w:color w:val="2F2F2F"/>
-          <w:sz w:val="20"/>
+          <w:sz w:val="22"/>
         </w:rPr>
         <w:t>Helped with installation and calibration of imaging and ICU devices.</w:t>
       </w:r>
@@ -560,14 +509,14 @@
     <w:p>
       <w:pPr>
         <w:pStyle w:val="ListBullet"/>
-        <w:spacing w:after="40" w:before="0" w:line="264" w:lineRule="auto"/>
+        <w:spacing w:after="40" w:before="0" w:line="269" w:lineRule="auto"/>
         <w:ind w:left="288"/>
       </w:pPr>
       <w:r>
         <w:rPr>
           <w:rFonts w:ascii="Calibri" w:hAnsi="Calibri"/>
           <w:color w:val="2F2F2F"/>
-          <w:sz w:val="20"/>
+          <w:sz w:val="22"/>
         </w:rPr>
         <w:t>Supported the hospital's preventive maintenance routines.</w:t>
       </w:r>
@@ -584,85 +533,69 @@
           <w:rFonts w:ascii="Calibri" w:hAnsi="Calibri"/>
           <w:b/>
           <w:color w:val="0F2C4C"/>
-          <w:sz w:val="21"/>
+          <w:sz w:val="23"/>
         </w:rPr>
-        <w:t>EARLIER ROLES</w:t>
-      </w:r>
-    </w:p>
-    <w:p>
-      <w:pPr>
-        <w:spacing w:before="160" w:after="40"/>
-      </w:pPr>
-      <w:r>
-        <w:rPr>
-          <w:rFonts w:ascii="Calibri" w:hAnsi="Calibri"/>
-          <w:b/>
-          <w:color w:val="1A1A1A"/>
-          <w:sz w:val="21"/>
-        </w:rPr>
-        <w:t>Research Intern, Uganda Virus Research Institute</w:t>
-      </w:r>
-      <w:r>
-        <w:rPr>
-          <w:rFonts w:ascii="Calibri" w:hAnsi="Calibri"/>
-          <w:i/>
-          <w:color w:val="1A6B5C"/>
-          <w:sz w:val="18"/>
-        </w:rPr>
-        <w:t xml:space="preserve">  |  Dec 2018 - Apr 2019</w:t>
+        <w:t>SELECTED HIGHLIGHTS</w:t>
       </w:r>
     </w:p>
     <w:p>
       <w:pPr>
         <w:pStyle w:val="ListBullet"/>
-        <w:spacing w:after="40" w:before="0" w:line="264" w:lineRule="auto"/>
+        <w:spacing w:after="40" w:before="0" w:line="269" w:lineRule="auto"/>
         <w:ind w:left="288"/>
       </w:pPr>
       <w:r>
         <w:rPr>
           <w:rFonts w:ascii="Calibri" w:hAnsi="Calibri"/>
           <w:color w:val="2F2F2F"/>
-          <w:sz w:val="20"/>
+          <w:sz w:val="22"/>
         </w:rPr>
-        <w:t>Helped with biomedical research and lab data work.</w:t>
-      </w:r>
-    </w:p>
-    <w:p>
-      <w:pPr>
-        <w:spacing w:before="160" w:after="40"/>
-      </w:pPr>
-      <w:r>
-        <w:rPr>
-          <w:rFonts w:ascii="Calibri" w:hAnsi="Calibri"/>
-          <w:b/>
-          <w:color w:val="1A1A1A"/>
-          <w:sz w:val="21"/>
-        </w:rPr>
-        <w:t>Teaching Assistant, Makerere University, College of Health Sciences</w:t>
-      </w:r>
-      <w:r>
-        <w:rPr>
-          <w:rFonts w:ascii="Calibri" w:hAnsi="Calibri"/>
-          <w:i/>
-          <w:color w:val="1A6B5C"/>
-          <w:sz w:val="18"/>
-        </w:rPr>
-        <w:t xml:space="preserve">  |  Mar 2016 - Aug 2017</w:t>
+        <w:t>Field biomedical work in Uganda, Congo, Kenya, Tanzania, and Somaliland.</w:t>
       </w:r>
     </w:p>
     <w:p>
       <w:pPr>
         <w:pStyle w:val="ListBullet"/>
-        <w:spacing w:after="40" w:before="0" w:line="264" w:lineRule="auto"/>
+        <w:spacing w:after="40" w:before="0" w:line="269" w:lineRule="auto"/>
         <w:ind w:left="288"/>
       </w:pPr>
       <w:r>
         <w:rPr>
           <w:rFonts w:ascii="Calibri" w:hAnsi="Calibri"/>
           <w:color w:val="2F2F2F"/>
-          <w:sz w:val="20"/>
+          <w:sz w:val="22"/>
         </w:rPr>
-        <w:t>Supported biomedical engineering classes and lab sessions.</w:t>
+        <w:t>At IHK, led equipment installation across laboratory, theatre, ICU, and radiology.</w:t>
+      </w:r>
+    </w:p>
+    <w:p>
+      <w:pPr>
+        <w:pStyle w:val="ListBullet"/>
+        <w:spacing w:after="40" w:before="0" w:line="269" w:lineRule="auto"/>
+        <w:ind w:left="288"/>
+      </w:pPr>
+      <w:r>
+        <w:rPr>
+          <w:rFonts w:ascii="Calibri" w:hAnsi="Calibri"/>
+          <w:color w:val="2F2F2F"/>
+          <w:sz w:val="22"/>
+        </w:rPr>
+        <w:t>Installed and supported haematology, chemistry, and blood bank laboratory machines alongside theatre and radiology systems.</w:t>
+      </w:r>
+    </w:p>
+    <w:p>
+      <w:pPr>
+        <w:pStyle w:val="ListBullet"/>
+        <w:spacing w:after="40" w:before="0" w:line="269" w:lineRule="auto"/>
+        <w:ind w:left="288"/>
+      </w:pPr>
+      <w:r>
+        <w:rPr>
+          <w:rFonts w:ascii="Calibri" w:hAnsi="Calibri"/>
+          <w:color w:val="2F2F2F"/>
+          <w:sz w:val="22"/>
+        </w:rPr>
+        <w:t>Congo installs include the hospital serving Kibali Gold Mine; supported COHSASA accreditation at IHK.</w:t>
       </w:r>
     </w:p>
     <w:p>
@@ -677,84 +610,7 @@
           <w:rFonts w:ascii="Calibri" w:hAnsi="Calibri"/>
           <w:b/>
           <w:color w:val="0F2C4C"/>
-          <w:sz w:val="21"/>
-        </w:rPr>
-        <w:t>SELECTED HIGHLIGHTS</w:t>
-      </w:r>
-    </w:p>
-    <w:p>
-      <w:pPr>
-        <w:pStyle w:val="ListBullet"/>
-        <w:spacing w:after="40" w:before="0" w:line="264" w:lineRule="auto"/>
-        <w:ind w:left="288"/>
-      </w:pPr>
-      <w:r>
-        <w:rPr>
-          <w:rFonts w:ascii="Calibri" w:hAnsi="Calibri"/>
-          <w:color w:val="2F2F2F"/>
-          <w:sz w:val="20"/>
-        </w:rPr>
-        <w:t>Field biomedical work in Uganda, Congo, Kenya, Tanzania, and Somaliland.</w:t>
-      </w:r>
-    </w:p>
-    <w:p>
-      <w:pPr>
-        <w:pStyle w:val="ListBullet"/>
-        <w:spacing w:after="40" w:before="0" w:line="264" w:lineRule="auto"/>
-        <w:ind w:left="288"/>
-      </w:pPr>
-      <w:r>
-        <w:rPr>
-          <w:rFonts w:ascii="Calibri" w:hAnsi="Calibri"/>
-          <w:color w:val="2F2F2F"/>
-          <w:sz w:val="20"/>
-        </w:rPr>
-        <w:t>Installed and supported haematology, chemistry, and blood bank laboratory machines alongside theatre and radiology systems.</w:t>
-      </w:r>
-    </w:p>
-    <w:p>
-      <w:pPr>
-        <w:pStyle w:val="ListBullet"/>
-        <w:spacing w:after="40" w:before="0" w:line="264" w:lineRule="auto"/>
-        <w:ind w:left="288"/>
-      </w:pPr>
-      <w:r>
-        <w:rPr>
-          <w:rFonts w:ascii="Calibri" w:hAnsi="Calibri"/>
-          <w:color w:val="2F2F2F"/>
-          <w:sz w:val="20"/>
-        </w:rPr>
-        <w:t>Congo installs include the hospital serving Kibali Gold Mine.</w:t>
-      </w:r>
-    </w:p>
-    <w:p>
-      <w:pPr>
-        <w:pStyle w:val="ListBullet"/>
-        <w:spacing w:after="40" w:before="0" w:line="264" w:lineRule="auto"/>
-        <w:ind w:left="288"/>
-      </w:pPr>
-      <w:r>
-        <w:rPr>
-          <w:rFonts w:ascii="Calibri" w:hAnsi="Calibri"/>
-          <w:color w:val="2F2F2F"/>
-          <w:sz w:val="20"/>
-        </w:rPr>
-        <w:t>Commissioned CT, X-ray, oxygen plant, and ICU systems in Uganda; supported COHSASA accreditation at IHK.</w:t>
-      </w:r>
-    </w:p>
-    <w:p>
-      <w:pPr>
-        <w:spacing w:before="200" w:after="80"/>
-        <w:pBdr>
-          <w:bottom w:val="single" w:sz="12" w:space="1" w:color="1A6B5C"/>
-        </w:pBdr>
-      </w:pPr>
-      <w:r>
-        <w:rPr>
-          <w:rFonts w:ascii="Calibri" w:hAnsi="Calibri"/>
-          <w:b/>
-          <w:color w:val="0F2C4C"/>
-          <w:sz w:val="21"/>
+          <w:sz w:val="23"/>
         </w:rPr>
         <w:t>EQUIPMENT EXPERIENCE</w:t>
       </w:r>
@@ -768,13 +624,13 @@
           <w:rFonts w:ascii="Calibri" w:hAnsi="Calibri"/>
           <w:b/>
           <w:color w:val="0F2C4C"/>
-          <w:sz w:val="20"/>
+          <w:sz w:val="22"/>
         </w:rPr>
         <w:t xml:space="preserve">Radiology / imaging: </w:t>
       </w:r>
       <w:r>
         <w:rPr>
-          <w:sz w:val="20"/>
+          <w:sz w:val="22"/>
         </w:rPr>
         <w:t>CT, X-ray, ultrasound, C-arm</w:t>
       </w:r>
@@ -788,13 +644,13 @@
           <w:rFonts w:ascii="Calibri" w:hAnsi="Calibri"/>
           <w:b/>
           <w:color w:val="0F2C4C"/>
-          <w:sz w:val="20"/>
+          <w:sz w:val="22"/>
         </w:rPr>
         <w:t xml:space="preserve">Theatre and ICU: </w:t>
       </w:r>
       <w:r>
         <w:rPr>
-          <w:sz w:val="20"/>
+          <w:sz w:val="22"/>
         </w:rPr>
         <w:t>Theatre systems, ventilators, monitors, infusion pumps</w:t>
       </w:r>
@@ -808,13 +664,13 @@
           <w:rFonts w:ascii="Calibri" w:hAnsi="Calibri"/>
           <w:b/>
           <w:color w:val="0F2C4C"/>
-          <w:sz w:val="20"/>
+          <w:sz w:val="22"/>
         </w:rPr>
         <w:t xml:space="preserve">Laboratory: </w:t>
       </w:r>
       <w:r>
         <w:rPr>
-          <w:sz w:val="20"/>
+          <w:sz w:val="22"/>
         </w:rPr>
         <w:t>Haematology analysers; clinical chemistry analysers; blood bank machines and transfusion support systems</w:t>
       </w:r>
@@ -828,13 +684,13 @@
           <w:rFonts w:ascii="Calibri" w:hAnsi="Calibri"/>
           <w:b/>
           <w:color w:val="0F2C4C"/>
-          <w:sz w:val="20"/>
+          <w:sz w:val="22"/>
         </w:rPr>
         <w:t xml:space="preserve">Support plant: </w:t>
       </w:r>
       <w:r>
         <w:rPr>
-          <w:sz w:val="20"/>
+          <w:sz w:val="22"/>
         </w:rPr>
         <w:t>Oxygen plants, RO water systems</w:t>
       </w:r>
@@ -848,13 +704,13 @@
           <w:rFonts w:ascii="Calibri" w:hAnsi="Calibri"/>
           <w:b/>
           <w:color w:val="0F2C4C"/>
-          <w:sz w:val="20"/>
+          <w:sz w:val="22"/>
         </w:rPr>
         <w:t xml:space="preserve">Maternity / neonatal: </w:t>
       </w:r>
       <w:r>
         <w:rPr>
-          <w:sz w:val="20"/>
+          <w:sz w:val="22"/>
         </w:rPr>
         <w:t>Incubators, phototherapy, foetal Dopplers, CTG</w:t>
       </w:r>
@@ -871,7 +727,7 @@
           <w:rFonts w:ascii="Calibri" w:hAnsi="Calibri"/>
           <w:b/>
           <w:color w:val="0F2C4C"/>
-          <w:sz w:val="21"/>
+          <w:sz w:val="23"/>
         </w:rPr>
         <w:t>EDUCATION AND ACADEMIC LEVELS</w:t>
       </w:r>
@@ -885,7 +741,7 @@
           <w:rFonts w:ascii="Calibri" w:hAnsi="Calibri"/>
           <w:b/>
           <w:color w:val="1A6B5C"/>
-          <w:sz w:val="20"/>
+          <w:sz w:val="21"/>
         </w:rPr>
         <w:t>Bachelor's degree (undergraduate)</w:t>
       </w:r>
@@ -898,9 +754,9 @@
         <w:rPr>
           <w:rFonts w:ascii="Calibri" w:hAnsi="Calibri"/>
           <w:b/>
-          <w:sz w:val="21"/>
+          <w:sz w:val="22"/>
         </w:rPr>
-        <w:t>Makerere University - Faculty of Medicine</w:t>
+        <w:t>Makerere University</w:t>
       </w:r>
     </w:p>
     <w:p>
@@ -911,7 +767,7 @@
         <w:rPr>
           <w:rFonts w:ascii="Calibri" w:hAnsi="Calibri"/>
           <w:color w:val="2F2F2F"/>
-          <w:sz w:val="21"/>
+          <w:sz w:val="22"/>
         </w:rPr>
         <w:t>BSc Biomedical Engineering, 2012-2016.</w:t>
       </w:r>
@@ -925,7 +781,7 @@
           <w:rFonts w:ascii="Calibri" w:hAnsi="Calibri"/>
           <w:b/>
           <w:color w:val="1A6B5C"/>
-          <w:sz w:val="20"/>
+          <w:sz w:val="21"/>
         </w:rPr>
         <w:t>Uganda Advanced Certificate of Education (A-Level)</w:t>
       </w:r>
@@ -938,7 +794,7 @@
         <w:rPr>
           <w:rFonts w:ascii="Calibri" w:hAnsi="Calibri"/>
           <w:b/>
-          <w:sz w:val="21"/>
+          <w:sz w:val="22"/>
         </w:rPr>
         <w:t>Mengo Secondary School</w:t>
       </w:r>
@@ -951,7 +807,7 @@
         <w:rPr>
           <w:rFonts w:ascii="Calibri" w:hAnsi="Calibri"/>
           <w:color w:val="2F2F2F"/>
-          <w:sz w:val="21"/>
+          <w:sz w:val="22"/>
         </w:rPr>
         <w:t>UACE 2011. Principal subjects: Mathematics, Physics, Biology, and Chemistry.</w:t>
       </w:r>
@@ -965,7 +821,7 @@
           <w:rFonts w:ascii="Calibri" w:hAnsi="Calibri"/>
           <w:b/>
           <w:color w:val="1A6B5C"/>
-          <w:sz w:val="20"/>
+          <w:sz w:val="21"/>
         </w:rPr>
         <w:t>Uganda Certificate of Education (O-Level)</w:t>
       </w:r>
@@ -978,7 +834,7 @@
         <w:rPr>
           <w:rFonts w:ascii="Calibri" w:hAnsi="Calibri"/>
           <w:b/>
-          <w:sz w:val="21"/>
+          <w:sz w:val="22"/>
         </w:rPr>
         <w:t>St. John's Wakiso Secondary School</w:t>
       </w:r>
@@ -991,7 +847,7 @@
         <w:rPr>
           <w:rFonts w:ascii="Calibri" w:hAnsi="Calibri"/>
           <w:color w:val="2F2F2F"/>
-          <w:sz w:val="21"/>
+          <w:sz w:val="22"/>
         </w:rPr>
         <w:t>UCE 2009.</w:t>
       </w:r>
@@ -1008,7 +864,7 @@
           <w:rFonts w:ascii="Calibri" w:hAnsi="Calibri"/>
           <w:b/>
           <w:color w:val="0F2C4C"/>
-          <w:sz w:val="21"/>
+          <w:sz w:val="23"/>
         </w:rPr>
         <w:t>CERTIFICATES AND SHORT COURSES</w:t>
       </w:r>
@@ -1022,7 +878,7 @@
           <w:rFonts w:ascii="Calibri" w:hAnsi="Calibri"/>
           <w:b/>
           <w:color w:val="1A6B5C"/>
-          <w:sz w:val="20"/>
+          <w:sz w:val="21"/>
         </w:rPr>
         <w:t>Professional development certificate</w:t>
       </w:r>
@@ -1035,7 +891,7 @@
         <w:rPr>
           <w:rFonts w:ascii="Calibri" w:hAnsi="Calibri"/>
           <w:b/>
-          <w:sz w:val="21"/>
+          <w:sz w:val="22"/>
         </w:rPr>
         <w:t>University of Washington</w:t>
       </w:r>
@@ -1048,7 +904,7 @@
         <w:rPr>
           <w:rFonts w:ascii="Calibri" w:hAnsi="Calibri"/>
           <w:color w:val="2F2F2F"/>
-          <w:sz w:val="21"/>
+          <w:sz w:val="22"/>
         </w:rPr>
         <w:t>Leadership and Management in Health, December 2022.</w:t>
       </w:r>
@@ -1062,7 +918,7 @@
           <w:rFonts w:ascii="Calibri" w:hAnsi="Calibri"/>
           <w:b/>
           <w:color w:val="1A6B5C"/>
-          <w:sz w:val="20"/>
+          <w:sz w:val="21"/>
         </w:rPr>
         <w:t>Technical certificate</w:t>
       </w:r>
@@ -1075,7 +931,7 @@
         <w:rPr>
           <w:rFonts w:ascii="Calibri" w:hAnsi="Calibri"/>
           <w:b/>
-          <w:sz w:val="21"/>
+          <w:sz w:val="22"/>
         </w:rPr>
         <w:t>Greenbridge School of Open Technologies</w:t>
       </w:r>
@@ -1088,49 +944,9 @@
         <w:rPr>
           <w:rFonts w:ascii="Calibri" w:hAnsi="Calibri"/>
           <w:color w:val="2F2F2F"/>
-          <w:sz w:val="21"/>
+          <w:sz w:val="22"/>
         </w:rPr>
         <w:t>JAVA Programming - Level 1, Dec 2015 - Jan 2016.</w:t>
-      </w:r>
-    </w:p>
-    <w:p>
-      <w:pPr>
-        <w:spacing w:before="80" w:after="20"/>
-      </w:pPr>
-      <w:r>
-        <w:rPr>
-          <w:rFonts w:ascii="Calibri" w:hAnsi="Calibri"/>
-          <w:b/>
-          <w:color w:val="1A6B5C"/>
-          <w:sz w:val="20"/>
-        </w:rPr>
-        <w:t>Workplace safety training</w:t>
-      </w:r>
-    </w:p>
-    <w:p>
-      <w:pPr>
-        <w:spacing w:before="0" w:after="0"/>
-      </w:pPr>
-      <w:r>
-        <w:rPr>
-          <w:rFonts w:ascii="Calibri" w:hAnsi="Calibri"/>
-          <w:b/>
-          <w:sz w:val="21"/>
-        </w:rPr>
-        <w:t>Fire Technologies Limited (IHK)</w:t>
-      </w:r>
-    </w:p>
-    <w:p>
-      <w:pPr>
-        <w:spacing w:after="40" w:before="0" w:line="276" w:lineRule="auto"/>
-      </w:pPr>
-      <w:r>
-        <w:rPr>
-          <w:rFonts w:ascii="Calibri" w:hAnsi="Calibri"/>
-          <w:color w:val="2F2F2F"/>
-          <w:sz w:val="21"/>
-        </w:rPr>
-        <w:t>Fire safety, prevention, firefighting, and evacuation drills, April 2021.</w:t>
       </w:r>
     </w:p>
     <w:p>
@@ -1145,7 +961,7 @@
           <w:rFonts w:ascii="Calibri" w:hAnsi="Calibri"/>
           <w:b/>
           <w:color w:val="0F2C4C"/>
-          <w:sz w:val="21"/>
+          <w:sz w:val="23"/>
         </w:rPr>
         <w:t>REFEREES</w:t>
       </w:r>
@@ -1158,7 +974,7 @@
         <w:rPr>
           <w:rFonts w:ascii="Calibri" w:hAnsi="Calibri"/>
           <w:color w:val="2F2F2F"/>
-          <w:sz w:val="21"/>
+          <w:sz w:val="22"/>
         </w:rPr>
         <w:t>Eng. Richard Ssejongo - Biomedical Engineer, St. Francis Hospital Nsambya - +256 753 818 754 / +256 777 132 489</w:t>
       </w:r>
@@ -1171,7 +987,7 @@
         <w:rPr>
           <w:rFonts w:ascii="Calibri" w:hAnsi="Calibri"/>
           <w:color w:val="2F2F2F"/>
-          <w:sz w:val="21"/>
+          <w:sz w:val="22"/>
         </w:rPr>
         <w:t>Dr. Annet Khingi - Senior Radiologist and Administrator, Mengo Hospital - +256 772 592 771 / +256 701 592 771</w:t>
       </w:r>
@@ -1184,7 +1000,7 @@
         <w:rPr>
           <w:rFonts w:ascii="Calibri" w:hAnsi="Calibri"/>
           <w:color w:val="2F2F2F"/>
-          <w:sz w:val="21"/>
+          <w:sz w:val="22"/>
         </w:rPr>
         <w:t>Racheal Nabukeera - Director, FairBanks Medical Centre - +256772849258 / nracheal017@gmail.com</w:t>
       </w:r>
@@ -1201,7 +1017,7 @@
           <w:rFonts w:ascii="Calibri" w:hAnsi="Calibri"/>
           <w:b/>
           <w:color w:val="0F2C4C"/>
-          <w:sz w:val="21"/>
+          <w:sz w:val="23"/>
         </w:rPr>
         <w:t>SIGNATURE</w:t>
       </w:r>
@@ -1256,7 +1072,7 @@
         <w:rPr>
           <w:rFonts w:ascii="Calibri" w:hAnsi="Calibri"/>
           <w:b/>
-          <w:sz w:val="21"/>
+          <w:sz w:val="22"/>
         </w:rPr>
         <w:t>Wasswa Wilson</w:t>
       </w:r>
@@ -1269,19 +1085,87 @@
       <w:r>
         <w:rPr>
           <w:color w:val="444444"/>
-          <w:sz w:val="20"/>
+          <w:sz w:val="21"/>
         </w:rPr>
         <w:t>Biomedical Engineer</w:t>
       </w:r>
     </w:p>
     <w:sectPr>
+      <w:footerReference w:type="default" r:id="rId10"/>
       <w:pgSz w:w="12240" w:h="15840"/>
-      <w:pgMar w:top="792" w:right="1008" w:bottom="792" w:left="1008" w:header="720" w:footer="720" w:gutter="0"/>
+      <w:pgMar w:top="720" w:right="936" w:bottom="720" w:left="936" w:header="720" w:footer="720" w:gutter="0"/>
       <w:cols w:space="720"/>
       <w:docGrid w:linePitch="360"/>
     </w:sectPr>
   </w:body>
 </w:document>
+</file>
+
+<file path=word/footer1.xml><?xml version="1.0" encoding="utf-8"?>
+<w:ftr xmlns:m="http://schemas.openxmlformats.org/officeDocument/2006/math" xmlns:mc="http://schemas.openxmlformats.org/markup-compatibility/2006" xmlns:mo="http://schemas.microsoft.com/office/mac/office/2008/main" xmlns:mv="urn:schemas-microsoft-com:mac:vml" xmlns:o="urn:schemas-microsoft-com:office:office" xmlns:r="http://schemas.openxmlformats.org/officeDocument/2006/relationships" xmlns:v="urn:schemas-microsoft-com:vml" xmlns:w10="urn:schemas-microsoft-com:office:word" xmlns:w14="http://schemas.microsoft.com/office/word/2010/wordml" xmlns:w="http://schemas.openxmlformats.org/wordprocessingml/2006/main" xmlns:wne="http://schemas.microsoft.com/office/word/2006/wordml" xmlns:wp14="http://schemas.microsoft.com/office/word/2010/wordprocessingDrawing" xmlns:wp="http://schemas.openxmlformats.org/drawingml/2006/wordprocessingDrawing" xmlns:wpc="http://schemas.microsoft.com/office/word/2010/wordprocessingCanvas" xmlns:wpg="http://schemas.microsoft.com/office/word/2010/wordprocessingGroup" xmlns:wpi="http://schemas.microsoft.com/office/word/2010/wordprocessingInk" xmlns:wps="http://schemas.microsoft.com/office/word/2010/wordprocessingShape" mc:Ignorable="w14 wp14">
+  <w:p>
+    <w:pPr>
+      <w:pStyle w:val="Footer"/>
+      <w:jc w:val="center"/>
+    </w:pPr>
+    <w:r>
+      <w:rPr>
+        <w:color w:val="5A5A5A"/>
+        <w:sz w:val="18"/>
+      </w:rPr>
+      <w:t xml:space="preserve">Page </w:t>
+    </w:r>
+    <w:r>
+      <w:rPr>
+        <w:color w:val="5A5A5A"/>
+        <w:sz w:val="18"/>
+      </w:rPr>
+      <w:fldChar w:fldCharType="begin"/>
+    </w:r>
+    <w:r>
+      <w:rPr>
+        <w:color w:val="5A5A5A"/>
+        <w:sz w:val="18"/>
+      </w:rPr>
+      <w:instrText xml:space="preserve"> PAGE </w:instrText>
+    </w:r>
+    <w:r>
+      <w:rPr>
+        <w:color w:val="5A5A5A"/>
+        <w:sz w:val="18"/>
+      </w:rPr>
+      <w:fldChar w:fldCharType="end"/>
+    </w:r>
+    <w:r>
+      <w:rPr>
+        <w:color w:val="5A5A5A"/>
+        <w:sz w:val="18"/>
+      </w:rPr>
+      <w:t xml:space="preserve"> of </w:t>
+    </w:r>
+    <w:r>
+      <w:rPr>
+        <w:color w:val="5A5A5A"/>
+        <w:sz w:val="18"/>
+      </w:rPr>
+      <w:fldChar w:fldCharType="begin"/>
+    </w:r>
+    <w:r>
+      <w:rPr>
+        <w:color w:val="5A5A5A"/>
+        <w:sz w:val="18"/>
+      </w:rPr>
+      <w:instrText xml:space="preserve"> NUMPAGES </w:instrText>
+    </w:r>
+    <w:r>
+      <w:rPr>
+        <w:color w:val="5A5A5A"/>
+        <w:sz w:val="18"/>
+      </w:rPr>
+      <w:fldChar w:fldCharType="end"/>
+    </w:r>
+  </w:p>
+</w:ftr>
 </file>
 
 <file path=word/numbering.xml><?xml version="1.0" encoding="utf-8"?>
@@ -1652,7 +1536,7 @@
     </w:pPr>
     <w:rPr>
       <w:rFonts w:ascii="Calibri" w:hAnsi="Calibri" w:eastAsia="Calibri"/>
-      <w:sz w:val="21"/>
+      <w:sz w:val="22"/>
     </w:rPr>
   </w:style>
   <w:style w:type="paragraph" w:styleId="Header">

</xml_diff>

<commit_message>
Expand Medequip CV and cover letter so field experience reads fuller, not compressed.
Restore earlier roles, richer role bullets, and clearer IHK/lab detail so the pack has room to breathe on three pages.

Co-authored-by: Cursor <cursoragent@cursor.com>
</commit_message>
<xml_diff>
--- a/wilson/medequip-rwanda/Wasswa_Wilson_CV_Medequip_Biomedical_Engineer.docx
+++ b/wilson/medequip-rwanda/Wasswa_Wilson_CV_Medequip_Biomedical_Engineer.docx
@@ -113,7 +113,7 @@
           <w:color w:val="2F2F2F"/>
           <w:sz w:val="22"/>
         </w:rPr>
-        <w:t>I am a biomedical engineer with over 7 years installing, commissioning, maintaining, and training users on hospital equipment across Uganda, Congo, Kenya, Tanzania, and Somaliland. At International Hospital Kampala I led equipment installs across laboratory, theatre, ICU, and radiology - including haematology, chemistry, and blood bank machines. Since early 2025 I have also worked on personal contracts, including Congo installs at the hospital serving Kibali Gold Mine. I travel for service jobs, work independently on site, write clear service notes, and train clinical staff. I want to bring that field experience to Medequip's clients across Rwanda and beyond.</w:t>
+        <w:t>I am a biomedical engineer with over 7 years of hands-on hospital experience: installing, commissioning, calibrating, maintaining, and training users on medical equipment. I have carried out this work in Uganda, the Democratic Republic of Congo, Kenya, Tanzania, and Somaliland. At International Hospital Kampala I led equipment installation across the laboratory, theatre, ICU, and radiology departments - covering haematology analysers, chemistry analysers, blood bank machines, CT, X-ray, oxygen plant, and critical-care systems. Since March 2025 I have also worked on personal contracts for hospitals that call me in for installs and service, including lab, theatre, and radiology work in Congo (among them the hospital that serves the Kibali Gold Mine). I am used to travelling for field jobs, working independently on site, writing clear service and maintenance notes, and handing over equipment with trained clinical staff. I want to bring that regional field experience to Medequip's technical team and clients across Rwanda and beyond.</w:t>
       </w:r>
     </w:p>
     <w:p>
@@ -173,6 +173,27 @@
           <w:sz w:val="22"/>
         </w:rPr>
         <w:t>Radiology (X-ray, CT, ultrasound, C-arm); theatre and ICU (ventilators, monitors, infusion pumps, theatre systems); laboratory (haematology analysers, chemistry analysers, blood bank machines); support plant (RO water, oxygen)</w:t>
+      </w:r>
+    </w:p>
+    <w:p>
+      <w:pPr>
+        <w:spacing w:after="60" w:line="264" w:lineRule="auto"/>
+      </w:pPr>
+      <w:r>
+        <w:rPr>
+          <w:rFonts w:ascii="Calibri" w:hAnsi="Calibri"/>
+          <w:b/>
+          <w:color w:val="0F2C4C"/>
+          <w:sz w:val="22"/>
+        </w:rPr>
+        <w:t xml:space="preserve">Countries worked: </w:t>
+      </w:r>
+      <w:r>
+        <w:rPr>
+          <w:color w:val="2F2F2F"/>
+          <w:sz w:val="22"/>
+        </w:rPr>
+        <w:t>Uganda, Democratic Republic of Congo, Kenya, Tanzania, and Somaliland - field installs, maintenance, and user training</w:t>
       </w:r>
     </w:p>
     <w:p>
@@ -269,7 +290,7 @@
           <w:color w:val="2F2F2F"/>
           <w:sz w:val="22"/>
         </w:rPr>
-        <w:t>Install and maintain medical equipment for hospitals on a personal-contract basis after leaving GFF, including field work in Uganda, Congo, Kenya, Tanzania, and Somaliland.</w:t>
+        <w:t>Install and maintain medical equipment for hospitals on a personal-contract basis after leaving GFF.</w:t>
       </w:r>
     </w:p>
     <w:p>
@@ -284,7 +305,7 @@
           <w:color w:val="2F2F2F"/>
           <w:sz w:val="22"/>
         </w:rPr>
-        <w:t>Completed lab, theatre, and radiology installations at several hospitals in Congo, including the hospital that serves the Kibali Gold Mine.</w:t>
+        <w:t>Complete field assignments in Uganda, Congo, Kenya, Tanzania, and Somaliland - travel to site, install or repair, train users, and report back to the client.</w:t>
       </w:r>
     </w:p>
     <w:p>
@@ -299,7 +320,7 @@
           <w:color w:val="2F2F2F"/>
           <w:sz w:val="22"/>
         </w:rPr>
-        <w:t>Lab installs and support cover haematology analysers, chemistry analysers, and blood bank machines, plus user handover.</w:t>
+        <w:t>Completed lab, theatre, and radiology installations at several hospitals in the Democratic Republic of Congo, including the hospital that serves the Kibali Gold Mine.</w:t>
       </w:r>
     </w:p>
     <w:p>
@@ -314,7 +335,22 @@
           <w:color w:val="2F2F2F"/>
           <w:sz w:val="22"/>
         </w:rPr>
-        <w:t>Handle preventive and corrective maintenance, on-site troubleshooting, and clear client reporting after each job.</w:t>
+        <w:t>Lab installs and support cover haematology analysers, clinical chemistry analysers, and blood bank machines, with user handover after commissioning.</w:t>
+      </w:r>
+    </w:p>
+    <w:p>
+      <w:pPr>
+        <w:pStyle w:val="ListBullet"/>
+        <w:spacing w:after="40" w:before="0" w:line="269" w:lineRule="auto"/>
+        <w:ind w:left="288"/>
+      </w:pPr>
+      <w:r>
+        <w:rPr>
+          <w:rFonts w:ascii="Calibri" w:hAnsi="Calibri"/>
+          <w:color w:val="2F2F2F"/>
+          <w:sz w:val="22"/>
+        </w:rPr>
+        <w:t>Handle preventive and corrective maintenance, on-site troubleshooting, and clear service documentation after each job.</w:t>
       </w:r>
     </w:p>
     <w:p>
@@ -352,7 +388,7 @@
           <w:color w:val="2F2F2F"/>
           <w:sz w:val="22"/>
         </w:rPr>
-        <w:t>Ran biomedical programmes across several health facilities.</w:t>
+        <w:t>Ran biomedical programmes across several health facilities, from planning through to equipment readiness.</w:t>
       </w:r>
     </w:p>
     <w:p>
@@ -367,7 +403,7 @@
           <w:color w:val="2F2F2F"/>
           <w:sz w:val="22"/>
         </w:rPr>
-        <w:t>Supported buying, installing, and commissioning medical equipment.</w:t>
+        <w:t>Supported buying, installing, and commissioning of medical technologies for partner sites.</w:t>
       </w:r>
     </w:p>
     <w:p>
@@ -382,7 +418,22 @@
           <w:color w:val="2F2F2F"/>
           <w:sz w:val="22"/>
         </w:rPr>
-        <w:t>Trained engineers and technicians, and kept work in line with healthcare technology standards.</w:t>
+        <w:t>Trained engineers and technicians on correct use and care of equipment.</w:t>
+      </w:r>
+    </w:p>
+    <w:p>
+      <w:pPr>
+        <w:pStyle w:val="ListBullet"/>
+        <w:spacing w:after="40" w:before="0" w:line="269" w:lineRule="auto"/>
+        <w:ind w:left="288"/>
+      </w:pPr>
+      <w:r>
+        <w:rPr>
+          <w:rFonts w:ascii="Calibri" w:hAnsi="Calibri"/>
+          <w:color w:val="2F2F2F"/>
+          <w:sz w:val="22"/>
+        </w:rPr>
+        <w:t>Kept work in line with healthcare technology and quality standards, including documentation for programme review.</w:t>
       </w:r>
     </w:p>
     <w:p>
@@ -420,7 +471,7 @@
           <w:color w:val="2F2F2F"/>
           <w:sz w:val="22"/>
         </w:rPr>
-        <w:t>Managed biomedical engineering for a major private hospital for four years.</w:t>
+        <w:t>Managed day-to-day biomedical engineering for a major private hospital for four years.</w:t>
       </w:r>
     </w:p>
     <w:p>
@@ -435,7 +486,7 @@
           <w:color w:val="2F2F2F"/>
           <w:sz w:val="22"/>
         </w:rPr>
-        <w:t>Led installation and commissioning across IHK laboratory, theatre, ICU, and radiology - including haematology, chemistry, and blood bank machines, plus CT, X-ray, and oxygen plant.</w:t>
+        <w:t>Led installation and commissioning of equipment across the IHK laboratory, theatre, ICU, and radiology departments.</w:t>
       </w:r>
     </w:p>
     <w:p>
@@ -450,7 +501,52 @@
           <w:color w:val="2F2F2F"/>
           <w:sz w:val="22"/>
         </w:rPr>
-        <w:t>Ran preventive maintenance, procurement support, service records, staff training, and COHSASA accreditation work.</w:t>
+        <w:t>Lab leadership included haematology analysers, chemistry analysers, and blood bank machines; imaging included CT and X-ray; ICU and theatre systems were part of the same programme.</w:t>
+      </w:r>
+    </w:p>
+    <w:p>
+      <w:pPr>
+        <w:pStyle w:val="ListBullet"/>
+        <w:spacing w:after="40" w:before="0" w:line="269" w:lineRule="auto"/>
+        <w:ind w:left="288"/>
+      </w:pPr>
+      <w:r>
+        <w:rPr>
+          <w:rFonts w:ascii="Calibri" w:hAnsi="Calibri"/>
+          <w:color w:val="2F2F2F"/>
+          <w:sz w:val="22"/>
+        </w:rPr>
+        <w:t>Also led installs of oxygen plant and related support systems.</w:t>
+      </w:r>
+    </w:p>
+    <w:p>
+      <w:pPr>
+        <w:pStyle w:val="ListBullet"/>
+        <w:spacing w:after="40" w:before="0" w:line="269" w:lineRule="auto"/>
+        <w:ind w:left="288"/>
+      </w:pPr>
+      <w:r>
+        <w:rPr>
+          <w:rFonts w:ascii="Calibri" w:hAnsi="Calibri"/>
+          <w:color w:val="2F2F2F"/>
+          <w:sz w:val="22"/>
+        </w:rPr>
+        <w:t>Set up preventive maintenance routines to cut downtime and keep devices safe for clinical use.</w:t>
+      </w:r>
+    </w:p>
+    <w:p>
+      <w:pPr>
+        <w:pStyle w:val="ListBullet"/>
+        <w:spacing w:after="40" w:before="0" w:line="269" w:lineRule="auto"/>
+        <w:ind w:left="288"/>
+      </w:pPr>
+      <w:r>
+        <w:rPr>
+          <w:rFonts w:ascii="Calibri" w:hAnsi="Calibri"/>
+          <w:color w:val="2F2F2F"/>
+          <w:sz w:val="22"/>
+        </w:rPr>
+        <w:t>Supported procurement, lifecycle planning, service records, staff training, and COHSASA accreditation work.</w:t>
       </w:r>
     </w:p>
     <w:p>
@@ -488,7 +584,7 @@
           <w:color w:val="2F2F2F"/>
           <w:sz w:val="22"/>
         </w:rPr>
-        <w:t>Serviced diagnostic and monitoring equipment day to day.</w:t>
+        <w:t>Serviced diagnostic and patient-monitoring equipment day to day.</w:t>
       </w:r>
     </w:p>
     <w:p>
@@ -503,7 +599,7 @@
           <w:color w:val="2F2F2F"/>
           <w:sz w:val="22"/>
         </w:rPr>
-        <w:t>Helped with installation and calibration of imaging and ICU devices.</w:t>
+        <w:t>Supported installation and calibration of imaging and ICU devices.</w:t>
       </w:r>
     </w:p>
     <w:p>
@@ -518,7 +614,100 @@
           <w:color w:val="2F2F2F"/>
           <w:sz w:val="22"/>
         </w:rPr>
-        <w:t>Supported the hospital's preventive maintenance routines.</w:t>
+        <w:t>Helped build and follow preventive maintenance schedules and service follow-up.</w:t>
+      </w:r>
+    </w:p>
+    <w:p>
+      <w:pPr>
+        <w:spacing w:before="200" w:after="80"/>
+        <w:pBdr>
+          <w:bottom w:val="single" w:sz="12" w:space="1" w:color="1A6B5C"/>
+        </w:pBdr>
+      </w:pPr>
+      <w:r>
+        <w:rPr>
+          <w:rFonts w:ascii="Calibri" w:hAnsi="Calibri"/>
+          <w:b/>
+          <w:color w:val="0F2C4C"/>
+          <w:sz w:val="23"/>
+        </w:rPr>
+        <w:t>EARLIER ROLES</w:t>
+      </w:r>
+    </w:p>
+    <w:p>
+      <w:pPr>
+        <w:spacing w:before="140" w:after="40"/>
+      </w:pPr>
+      <w:r>
+        <w:rPr>
+          <w:rFonts w:ascii="Calibri" w:hAnsi="Calibri"/>
+          <w:b/>
+          <w:color w:val="1A1A1A"/>
+          <w:sz w:val="22"/>
+        </w:rPr>
+        <w:t>Research Intern, Uganda Virus Research Institute</w:t>
+      </w:r>
+      <w:r>
+        <w:rPr>
+          <w:rFonts w:ascii="Calibri" w:hAnsi="Calibri"/>
+          <w:i/>
+          <w:color w:val="1A6B5C"/>
+          <w:sz w:val="20"/>
+        </w:rPr>
+        <w:t xml:space="preserve">  |  Dec 2018 - Apr 2019</w:t>
+      </w:r>
+    </w:p>
+    <w:p>
+      <w:pPr>
+        <w:pStyle w:val="ListBullet"/>
+        <w:spacing w:after="40" w:before="0" w:line="269" w:lineRule="auto"/>
+        <w:ind w:left="288"/>
+      </w:pPr>
+      <w:r>
+        <w:rPr>
+          <w:rFonts w:ascii="Calibri" w:hAnsi="Calibri"/>
+          <w:color w:val="2F2F2F"/>
+          <w:sz w:val="22"/>
+        </w:rPr>
+        <w:t>Supported biomedical research projects and laboratory data work.</w:t>
+      </w:r>
+    </w:p>
+    <w:p>
+      <w:pPr>
+        <w:spacing w:before="140" w:after="40"/>
+      </w:pPr>
+      <w:r>
+        <w:rPr>
+          <w:rFonts w:ascii="Calibri" w:hAnsi="Calibri"/>
+          <w:b/>
+          <w:color w:val="1A1A1A"/>
+          <w:sz w:val="22"/>
+        </w:rPr>
+        <w:t>Teaching Assistant, Makerere University, College of Health Sciences</w:t>
+      </w:r>
+      <w:r>
+        <w:rPr>
+          <w:rFonts w:ascii="Calibri" w:hAnsi="Calibri"/>
+          <w:i/>
+          <w:color w:val="1A6B5C"/>
+          <w:sz w:val="20"/>
+        </w:rPr>
+        <w:t xml:space="preserve">  |  Mar 2016 - Aug 2017</w:t>
+      </w:r>
+    </w:p>
+    <w:p>
+      <w:pPr>
+        <w:pStyle w:val="ListBullet"/>
+        <w:spacing w:after="40" w:before="0" w:line="269" w:lineRule="auto"/>
+        <w:ind w:left="288"/>
+      </w:pPr>
+      <w:r>
+        <w:rPr>
+          <w:rFonts w:ascii="Calibri" w:hAnsi="Calibri"/>
+          <w:color w:val="2F2F2F"/>
+          <w:sz w:val="22"/>
+        </w:rPr>
+        <w:t>Supported biomedical engineering teaching and laboratory practical sessions.</w:t>
       </w:r>
     </w:p>
     <w:p>
@@ -550,7 +739,7 @@
           <w:color w:val="2F2F2F"/>
           <w:sz w:val="22"/>
         </w:rPr>
-        <w:t>Field biomedical work in Uganda, Congo, Kenya, Tanzania, and Somaliland.</w:t>
+        <w:t>7+ years of hands-on hospital biomedical work across Uganda, Congo, Kenya, Tanzania, and Somaliland.</w:t>
       </w:r>
     </w:p>
     <w:p>
@@ -565,7 +754,7 @@
           <w:color w:val="2F2F2F"/>
           <w:sz w:val="22"/>
         </w:rPr>
-        <w:t>At IHK, led equipment installation across laboratory, theatre, ICU, and radiology.</w:t>
+        <w:t>At IHK, led equipment installation across laboratory, theatre, ICU, and radiology departments.</w:t>
       </w:r>
     </w:p>
     <w:p>
@@ -595,7 +784,37 @@
           <w:color w:val="2F2F2F"/>
           <w:sz w:val="22"/>
         </w:rPr>
-        <w:t>Congo installs include the hospital serving Kibali Gold Mine; supported COHSASA accreditation at IHK.</w:t>
+        <w:t>Completed Congo hospital installs including the facility serving Kibali Gold Mine.</w:t>
+      </w:r>
+    </w:p>
+    <w:p>
+      <w:pPr>
+        <w:pStyle w:val="ListBullet"/>
+        <w:spacing w:after="40" w:before="0" w:line="269" w:lineRule="auto"/>
+        <w:ind w:left="288"/>
+      </w:pPr>
+      <w:r>
+        <w:rPr>
+          <w:rFonts w:ascii="Calibri" w:hAnsi="Calibri"/>
+          <w:color w:val="2F2F2F"/>
+          <w:sz w:val="22"/>
+        </w:rPr>
+        <w:t>Commissioned CT, X-ray, oxygen plant, and ICU systems in Uganda and supported COHSASA accreditation at IHK.</w:t>
+      </w:r>
+    </w:p>
+    <w:p>
+      <w:pPr>
+        <w:pStyle w:val="ListBullet"/>
+        <w:spacing w:after="40" w:before="0" w:line="269" w:lineRule="auto"/>
+        <w:ind w:left="288"/>
+      </w:pPr>
+      <w:r>
+        <w:rPr>
+          <w:rFonts w:ascii="Calibri" w:hAnsi="Calibri"/>
+          <w:color w:val="2F2F2F"/>
+          <w:sz w:val="22"/>
+        </w:rPr>
+        <w:t>Trained engineers, technicians, and clinical users so equipment stays useful after install day.</w:t>
       </w:r>
     </w:p>
     <w:p>
@@ -632,7 +851,7 @@
         <w:rPr>
           <w:sz w:val="22"/>
         </w:rPr>
-        <w:t>CT, X-ray, ultrasound, C-arm</w:t>
+        <w:t>CT scanners, X-ray machines, ultrasound systems, C-arms</w:t>
       </w:r>
     </w:p>
     <w:p>
@@ -652,7 +871,7 @@
         <w:rPr>
           <w:sz w:val="22"/>
         </w:rPr>
-        <w:t>Theatre systems, ventilators, monitors, infusion pumps</w:t>
+        <w:t>Theatre systems, ventilators, patient monitors, infusion pumps, related critical-care devices</w:t>
       </w:r>
     </w:p>
     <w:p>
@@ -666,13 +885,53 @@
           <w:color w:val="0F2C4C"/>
           <w:sz w:val="22"/>
         </w:rPr>
-        <w:t xml:space="preserve">Laboratory: </w:t>
+        <w:t xml:space="preserve">Laboratory - haematology: </w:t>
       </w:r>
       <w:r>
         <w:rPr>
           <w:sz w:val="22"/>
         </w:rPr>
-        <w:t>Haematology analysers; clinical chemistry analysers; blood bank machines and transfusion support systems</w:t>
+        <w:t>Haematology analysers and related blood-count laboratory systems</w:t>
+      </w:r>
+    </w:p>
+    <w:p>
+      <w:pPr>
+        <w:spacing w:after="60"/>
+      </w:pPr>
+      <w:r>
+        <w:rPr>
+          <w:rFonts w:ascii="Calibri" w:hAnsi="Calibri"/>
+          <w:b/>
+          <w:color w:val="0F2C4C"/>
+          <w:sz w:val="22"/>
+        </w:rPr>
+        <w:t xml:space="preserve">Laboratory - chemistry: </w:t>
+      </w:r>
+      <w:r>
+        <w:rPr>
+          <w:sz w:val="22"/>
+        </w:rPr>
+        <w:t>Clinical chemistry analysers and related chemistry lab systems</w:t>
+      </w:r>
+    </w:p>
+    <w:p>
+      <w:pPr>
+        <w:spacing w:after="60"/>
+      </w:pPr>
+      <w:r>
+        <w:rPr>
+          <w:rFonts w:ascii="Calibri" w:hAnsi="Calibri"/>
+          <w:b/>
+          <w:color w:val="0F2C4C"/>
+          <w:sz w:val="22"/>
+        </w:rPr>
+        <w:t xml:space="preserve">Laboratory - blood bank: </w:t>
+      </w:r>
+      <w:r>
+        <w:rPr>
+          <w:sz w:val="22"/>
+        </w:rPr>
+        <w:t>Blood bank machines and transfusion / blood-banking support equipment</w:t>
       </w:r>
     </w:p>
     <w:p>
@@ -712,7 +971,7 @@
         <w:rPr>
           <w:sz w:val="22"/>
         </w:rPr>
-        <w:t>Incubators, phototherapy, foetal Dopplers, CTG</w:t>
+        <w:t>Incubators, phototherapy units, foetal Dopplers, CTG</w:t>
       </w:r>
     </w:p>
     <w:p>
@@ -947,6 +1206,46 @@
           <w:sz w:val="22"/>
         </w:rPr>
         <w:t>JAVA Programming - Level 1, Dec 2015 - Jan 2016.</w:t>
+      </w:r>
+    </w:p>
+    <w:p>
+      <w:pPr>
+        <w:spacing w:before="80" w:after="20"/>
+      </w:pPr>
+      <w:r>
+        <w:rPr>
+          <w:rFonts w:ascii="Calibri" w:hAnsi="Calibri"/>
+          <w:b/>
+          <w:color w:val="1A6B5C"/>
+          <w:sz w:val="21"/>
+        </w:rPr>
+        <w:t>Workplace safety training</w:t>
+      </w:r>
+    </w:p>
+    <w:p>
+      <w:pPr>
+        <w:spacing w:before="0" w:after="0"/>
+      </w:pPr>
+      <w:r>
+        <w:rPr>
+          <w:rFonts w:ascii="Calibri" w:hAnsi="Calibri"/>
+          <w:b/>
+          <w:sz w:val="22"/>
+        </w:rPr>
+        <w:t>Fire Technologies Limited (IHK)</w:t>
+      </w:r>
+    </w:p>
+    <w:p>
+      <w:pPr>
+        <w:spacing w:after="40" w:before="0" w:line="276" w:lineRule="auto"/>
+      </w:pPr>
+      <w:r>
+        <w:rPr>
+          <w:rFonts w:ascii="Calibri" w:hAnsi="Calibri"/>
+          <w:color w:val="2F2F2F"/>
+          <w:sz w:val="22"/>
+        </w:rPr>
+        <w:t>Fire safety, prevention, firefighting, emergency scene management, and evacuation drills, April 2021.</w:t>
       </w:r>
     </w:p>
     <w:p>

</xml_diff>